<commit_message>
updates to ENES222 lectures14-15
</commit_message>
<xml_diff>
--- a/Signals/html_Lectures/notes/Lecture 14 Notes.docx
+++ b/Signals/html_Lectures/notes/Lecture 14 Notes.docx
@@ -199,6 +199,24 @@
           <w:szCs w:val="26"/>
         </w:rPr>
         <w:t xml:space="preserve">  —  Concept — Three Matrices (≈ 2 min)</w:t>
+      </w:r>
+    </w:p>
+    <w:p>
+      <w:pPr>
+        <w:pStyle w:val="ListParagraph"/>
+        <w:numPr>
+          <w:ilvl w:val="0"/>
+          <w:numId w:val="2"/>
+        </w:numPr>
+        <w:spacing w:after="80"/>
+      </w:pPr>
+      <w:r>
+        <w:rPr>
+          <w:rFonts w:ascii="Calibri" w:cs="Calibri" w:eastAsia="Calibri" w:hAnsi="Calibri"/>
+          <w:sz w:val="22"/>
+          <w:szCs w:val="22"/>
+        </w:rPr>
+        <w:t xml:space="preserve">Notation: mod N. a mod N is the remainder of a divided by N, always between 0 and N−1; an index that leaves that range wraps around (−1 mod N = N−1). With N = 4, (Px)[0] = x[(0−1) mod 4] = x[3]: the last entry moves to the top. Say this before showing P, since every formula in the next slides uses it.</w:t>
       </w:r>
     </w:p>
     <w:p>

</xml_diff>